<commit_message>
Add Docker, CI, and env-based deploy config
</commit_message>
<xml_diff>
--- a/docs/API_DOCUMENTATION.docx
+++ b/docs/API_DOCUMENTATION.docx
@@ -114,6 +114,12 @@
               <w:right w:w="60" w:type="dxa"/>
             </w:tcMar>
             <w:shd w:fill="1A365D" w:val="clear"/>
+            <w:tcMar>
+              <w:top w:w="40" w:type="dxa"/>
+              <w:bottom w:w="40" w:type="dxa"/>
+              <w:left w:w="60" w:type="dxa"/>
+              <w:right w:w="60" w:type="dxa"/>
+            </w:tcMar>
           </w:tcPr>
           <w:p>
             <w:pPr>
@@ -141,6 +147,12 @@
               <w:right w:w="60" w:type="dxa"/>
             </w:tcMar>
             <w:shd w:fill="1A365D" w:val="clear"/>
+            <w:tcMar>
+              <w:top w:w="40" w:type="dxa"/>
+              <w:bottom w:w="40" w:type="dxa"/>
+              <w:left w:w="60" w:type="dxa"/>
+              <w:right w:w="60" w:type="dxa"/>
+            </w:tcMar>
           </w:tcPr>
           <w:p>
             <w:pPr>
@@ -168,6 +180,12 @@
               <w:right w:w="60" w:type="dxa"/>
             </w:tcMar>
             <w:shd w:fill="1A365D" w:val="clear"/>
+            <w:tcMar>
+              <w:top w:w="40" w:type="dxa"/>
+              <w:bottom w:w="40" w:type="dxa"/>
+              <w:left w:w="60" w:type="dxa"/>
+              <w:right w:w="60" w:type="dxa"/>
+            </w:tcMar>
           </w:tcPr>
           <w:p>
             <w:pPr>
@@ -195,6 +213,12 @@
               <w:right w:w="60" w:type="dxa"/>
             </w:tcMar>
             <w:shd w:fill="1A365D" w:val="clear"/>
+            <w:tcMar>
+              <w:top w:w="40" w:type="dxa"/>
+              <w:bottom w:w="40" w:type="dxa"/>
+              <w:left w:w="60" w:type="dxa"/>
+              <w:right w:w="60" w:type="dxa"/>
+            </w:tcMar>
           </w:tcPr>
           <w:p>
             <w:pPr>
@@ -222,6 +246,12 @@
               <w:right w:w="60" w:type="dxa"/>
             </w:tcMar>
             <w:shd w:fill="1A365D" w:val="clear"/>
+            <w:tcMar>
+              <w:top w:w="40" w:type="dxa"/>
+              <w:bottom w:w="40" w:type="dxa"/>
+              <w:left w:w="60" w:type="dxa"/>
+              <w:right w:w="60" w:type="dxa"/>
+            </w:tcMar>
           </w:tcPr>
           <w:p>
             <w:pPr>
@@ -250,6 +280,12 @@
               <w:left w:w="60" w:type="dxa"/>
               <w:right w:w="60" w:type="dxa"/>
             </w:tcMar>
+            <w:tcMar>
+              <w:top w:w="40" w:type="dxa"/>
+              <w:bottom w:w="40" w:type="dxa"/>
+              <w:left w:w="60" w:type="dxa"/>
+              <w:right w:w="60" w:type="dxa"/>
+            </w:tcMar>
           </w:tcPr>
           <w:p>
             <w:pPr>
@@ -268,6 +304,12 @@
         </w:tc>
         <w:tc>
           <w:tcPr>
+            <w:tcMar>
+              <w:top w:w="40" w:type="dxa"/>
+              <w:bottom w:w="40" w:type="dxa"/>
+              <w:left w:w="60" w:type="dxa"/>
+              <w:right w:w="60" w:type="dxa"/>
+            </w:tcMar>
             <w:tcMar>
               <w:top w:w="40" w:type="dxa"/>
               <w:bottom w:w="40" w:type="dxa"/>
@@ -293,6 +335,12 @@
         </w:tc>
         <w:tc>
           <w:tcPr>
+            <w:tcMar>
+              <w:top w:w="40" w:type="dxa"/>
+              <w:bottom w:w="40" w:type="dxa"/>
+              <w:left w:w="60" w:type="dxa"/>
+              <w:right w:w="60" w:type="dxa"/>
+            </w:tcMar>
             <w:tcMar>
               <w:top w:w="40" w:type="dxa"/>
               <w:bottom w:w="40" w:type="dxa"/>
@@ -325,6 +373,12 @@
               <w:left w:w="60" w:type="dxa"/>
               <w:right w:w="60" w:type="dxa"/>
             </w:tcMar>
+            <w:tcMar>
+              <w:top w:w="40" w:type="dxa"/>
+              <w:bottom w:w="40" w:type="dxa"/>
+              <w:left w:w="60" w:type="dxa"/>
+              <w:right w:w="60" w:type="dxa"/>
+            </w:tcMar>
           </w:tcPr>
           <w:p>
             <w:pPr>
@@ -344,6 +398,12 @@
         </w:tc>
         <w:tc>
           <w:tcPr>
+            <w:tcMar>
+              <w:top w:w="40" w:type="dxa"/>
+              <w:bottom w:w="40" w:type="dxa"/>
+              <w:left w:w="60" w:type="dxa"/>
+              <w:right w:w="60" w:type="dxa"/>
+            </w:tcMar>
             <w:tcMar>
               <w:top w:w="40" w:type="dxa"/>
               <w:bottom w:w="40" w:type="dxa"/>
@@ -406,6 +466,12 @@
               <w:left w:w="60" w:type="dxa"/>
               <w:right w:w="60" w:type="dxa"/>
             </w:tcMar>
+            <w:tcMar>
+              <w:top w:w="40" w:type="dxa"/>
+              <w:bottom w:w="40" w:type="dxa"/>
+              <w:left w:w="60" w:type="dxa"/>
+              <w:right w:w="60" w:type="dxa"/>
+            </w:tcMar>
           </w:tcPr>
           <w:p>
             <w:pPr>
@@ -424,6 +490,12 @@
         </w:tc>
         <w:tc>
           <w:tcPr>
+            <w:tcMar>
+              <w:top w:w="40" w:type="dxa"/>
+              <w:bottom w:w="40" w:type="dxa"/>
+              <w:left w:w="60" w:type="dxa"/>
+              <w:right w:w="60" w:type="dxa"/>
+            </w:tcMar>
             <w:tcMar>
               <w:top w:w="40" w:type="dxa"/>
               <w:bottom w:w="40" w:type="dxa"/>
@@ -455,6 +527,12 @@
               <w:left w:w="60" w:type="dxa"/>
               <w:right w:w="60" w:type="dxa"/>
             </w:tcMar>
+            <w:tcMar>
+              <w:top w:w="40" w:type="dxa"/>
+              <w:bottom w:w="40" w:type="dxa"/>
+              <w:left w:w="60" w:type="dxa"/>
+              <w:right w:w="60" w:type="dxa"/>
+            </w:tcMar>
           </w:tcPr>
           <w:p>
             <w:pPr>
@@ -479,6 +557,12 @@
               <w:left w:w="60" w:type="dxa"/>
               <w:right w:w="60" w:type="dxa"/>
             </w:tcMar>
+            <w:tcMar>
+              <w:top w:w="40" w:type="dxa"/>
+              <w:bottom w:w="40" w:type="dxa"/>
+              <w:left w:w="60" w:type="dxa"/>
+              <w:right w:w="60" w:type="dxa"/>
+            </w:tcMar>
           </w:tcPr>
           <w:p>
             <w:pPr>
@@ -497,6 +581,12 @@
         </w:tc>
         <w:tc>
           <w:tcPr>
+            <w:tcMar>
+              <w:top w:w="40" w:type="dxa"/>
+              <w:bottom w:w="40" w:type="dxa"/>
+              <w:left w:w="60" w:type="dxa"/>
+              <w:right w:w="60" w:type="dxa"/>
+            </w:tcMar>
             <w:tcMar>
               <w:top w:w="40" w:type="dxa"/>
               <w:bottom w:w="40" w:type="dxa"/>
@@ -530,6 +620,12 @@
               <w:left w:w="60" w:type="dxa"/>
               <w:right w:w="60" w:type="dxa"/>
             </w:tcMar>
+            <w:tcMar>
+              <w:top w:w="40" w:type="dxa"/>
+              <w:bottom w:w="40" w:type="dxa"/>
+              <w:left w:w="60" w:type="dxa"/>
+              <w:right w:w="60" w:type="dxa"/>
+            </w:tcMar>
           </w:tcPr>
           <w:p>
             <w:pPr>
@@ -548,6 +644,12 @@
         </w:tc>
         <w:tc>
           <w:tcPr>
+            <w:tcMar>
+              <w:top w:w="40" w:type="dxa"/>
+              <w:bottom w:w="40" w:type="dxa"/>
+              <w:left w:w="60" w:type="dxa"/>
+              <w:right w:w="60" w:type="dxa"/>
+            </w:tcMar>
             <w:tcMar>
               <w:top w:w="40" w:type="dxa"/>
               <w:bottom w:w="40" w:type="dxa"/>
@@ -579,6 +681,12 @@
               <w:left w:w="60" w:type="dxa"/>
               <w:right w:w="60" w:type="dxa"/>
             </w:tcMar>
+            <w:tcMar>
+              <w:top w:w="40" w:type="dxa"/>
+              <w:bottom w:w="40" w:type="dxa"/>
+              <w:left w:w="60" w:type="dxa"/>
+              <w:right w:w="60" w:type="dxa"/>
+            </w:tcMar>
           </w:tcPr>
           <w:p>
             <w:pPr>
@@ -597,6 +705,12 @@
         </w:tc>
         <w:tc>
           <w:tcPr>
+            <w:tcMar>
+              <w:top w:w="40" w:type="dxa"/>
+              <w:bottom w:w="40" w:type="dxa"/>
+              <w:left w:w="60" w:type="dxa"/>
+              <w:right w:w="60" w:type="dxa"/>
+            </w:tcMar>
             <w:tcMar>
               <w:top w:w="40" w:type="dxa"/>
               <w:bottom w:w="40" w:type="dxa"/>
@@ -622,6 +736,12 @@
         </w:tc>
         <w:tc>
           <w:tcPr>
+            <w:tcMar>
+              <w:top w:w="40" w:type="dxa"/>
+              <w:bottom w:w="40" w:type="dxa"/>
+              <w:left w:w="60" w:type="dxa"/>
+              <w:right w:w="60" w:type="dxa"/>
+            </w:tcMar>
             <w:tcMar>
               <w:top w:w="40" w:type="dxa"/>
               <w:bottom w:w="40" w:type="dxa"/>
@@ -699,6 +819,12 @@
               <w:right w:w="60" w:type="dxa"/>
             </w:tcMar>
             <w:shd w:fill="1A365D" w:val="clear"/>
+            <w:tcMar>
+              <w:top w:w="40" w:type="dxa"/>
+              <w:bottom w:w="40" w:type="dxa"/>
+              <w:left w:w="60" w:type="dxa"/>
+              <w:right w:w="60" w:type="dxa"/>
+            </w:tcMar>
           </w:tcPr>
           <w:p>
             <w:pPr>
@@ -726,6 +852,12 @@
               <w:right w:w="60" w:type="dxa"/>
             </w:tcMar>
             <w:shd w:fill="1A365D" w:val="clear"/>
+            <w:tcMar>
+              <w:top w:w="40" w:type="dxa"/>
+              <w:bottom w:w="40" w:type="dxa"/>
+              <w:left w:w="60" w:type="dxa"/>
+              <w:right w:w="60" w:type="dxa"/>
+            </w:tcMar>
           </w:tcPr>
           <w:p>
             <w:pPr>
@@ -753,6 +885,12 @@
               <w:right w:w="60" w:type="dxa"/>
             </w:tcMar>
             <w:shd w:fill="1A365D" w:val="clear"/>
+            <w:tcMar>
+              <w:top w:w="40" w:type="dxa"/>
+              <w:bottom w:w="40" w:type="dxa"/>
+              <w:left w:w="60" w:type="dxa"/>
+              <w:right w:w="60" w:type="dxa"/>
+            </w:tcMar>
           </w:tcPr>
           <w:p>
             <w:pPr>
@@ -780,6 +918,12 @@
               <w:right w:w="60" w:type="dxa"/>
             </w:tcMar>
             <w:shd w:fill="1A365D" w:val="clear"/>
+            <w:tcMar>
+              <w:top w:w="40" w:type="dxa"/>
+              <w:bottom w:w="40" w:type="dxa"/>
+              <w:left w:w="60" w:type="dxa"/>
+              <w:right w:w="60" w:type="dxa"/>
+            </w:tcMar>
           </w:tcPr>
           <w:p>
             <w:pPr>
@@ -808,6 +952,12 @@
               <w:left w:w="60" w:type="dxa"/>
               <w:right w:w="60" w:type="dxa"/>
             </w:tcMar>
+            <w:tcMar>
+              <w:top w:w="40" w:type="dxa"/>
+              <w:bottom w:w="40" w:type="dxa"/>
+              <w:left w:w="60" w:type="dxa"/>
+              <w:right w:w="60" w:type="dxa"/>
+            </w:tcMar>
           </w:tcPr>
           <w:p>
             <w:pPr>
@@ -826,6 +976,12 @@
         </w:tc>
         <w:tc>
           <w:tcPr>
+            <w:tcMar>
+              <w:top w:w="40" w:type="dxa"/>
+              <w:bottom w:w="40" w:type="dxa"/>
+              <w:left w:w="60" w:type="dxa"/>
+              <w:right w:w="60" w:type="dxa"/>
+            </w:tcMar>
             <w:tcMar>
               <w:top w:w="40" w:type="dxa"/>
               <w:bottom w:w="40" w:type="dxa"/>
@@ -857,6 +1013,12 @@
               <w:left w:w="60" w:type="dxa"/>
               <w:right w:w="60" w:type="dxa"/>
             </w:tcMar>
+            <w:tcMar>
+              <w:top w:w="40" w:type="dxa"/>
+              <w:bottom w:w="40" w:type="dxa"/>
+              <w:left w:w="60" w:type="dxa"/>
+              <w:right w:w="60" w:type="dxa"/>
+            </w:tcMar>
           </w:tcPr>
           <w:p>
             <w:pPr>
@@ -875,6 +1037,12 @@
         </w:tc>
         <w:tc>
           <w:tcPr>
+            <w:tcMar>
+              <w:top w:w="40" w:type="dxa"/>
+              <w:bottom w:w="40" w:type="dxa"/>
+              <w:left w:w="60" w:type="dxa"/>
+              <w:right w:w="60" w:type="dxa"/>
+            </w:tcMar>
             <w:tcMar>
               <w:top w:w="40" w:type="dxa"/>
               <w:bottom w:w="40" w:type="dxa"/>
@@ -966,6 +1134,12 @@
               <w:right w:w="60" w:type="dxa"/>
             </w:tcMar>
             <w:shd w:fill="1A365D" w:val="clear"/>
+            <w:tcMar>
+              <w:top w:w="40" w:type="dxa"/>
+              <w:bottom w:w="40" w:type="dxa"/>
+              <w:left w:w="60" w:type="dxa"/>
+              <w:right w:w="60" w:type="dxa"/>
+            </w:tcMar>
           </w:tcPr>
           <w:p>
             <w:pPr>
@@ -993,6 +1167,12 @@
               <w:right w:w="60" w:type="dxa"/>
             </w:tcMar>
             <w:shd w:fill="1A365D" w:val="clear"/>
+            <w:tcMar>
+              <w:top w:w="40" w:type="dxa"/>
+              <w:bottom w:w="40" w:type="dxa"/>
+              <w:left w:w="60" w:type="dxa"/>
+              <w:right w:w="60" w:type="dxa"/>
+            </w:tcMar>
           </w:tcPr>
           <w:p>
             <w:pPr>
@@ -1020,6 +1200,12 @@
               <w:right w:w="60" w:type="dxa"/>
             </w:tcMar>
             <w:shd w:fill="1A365D" w:val="clear"/>
+            <w:tcMar>
+              <w:top w:w="40" w:type="dxa"/>
+              <w:bottom w:w="40" w:type="dxa"/>
+              <w:left w:w="60" w:type="dxa"/>
+              <w:right w:w="60" w:type="dxa"/>
+            </w:tcMar>
           </w:tcPr>
           <w:p>
             <w:pPr>
@@ -1047,6 +1233,12 @@
               <w:right w:w="60" w:type="dxa"/>
             </w:tcMar>
             <w:shd w:fill="1A365D" w:val="clear"/>
+            <w:tcMar>
+              <w:top w:w="40" w:type="dxa"/>
+              <w:bottom w:w="40" w:type="dxa"/>
+              <w:left w:w="60" w:type="dxa"/>
+              <w:right w:w="60" w:type="dxa"/>
+            </w:tcMar>
           </w:tcPr>
           <w:p>
             <w:pPr>
@@ -1075,6 +1267,12 @@
               <w:left w:w="60" w:type="dxa"/>
               <w:right w:w="60" w:type="dxa"/>
             </w:tcMar>
+            <w:tcMar>
+              <w:top w:w="40" w:type="dxa"/>
+              <w:bottom w:w="40" w:type="dxa"/>
+              <w:left w:w="60" w:type="dxa"/>
+              <w:right w:w="60" w:type="dxa"/>
+            </w:tcMar>
           </w:tcPr>
           <w:p>
             <w:pPr>
@@ -1093,6 +1291,12 @@
         </w:tc>
         <w:tc>
           <w:tcPr>
+            <w:tcMar>
+              <w:top w:w="40" w:type="dxa"/>
+              <w:bottom w:w="40" w:type="dxa"/>
+              <w:left w:w="60" w:type="dxa"/>
+              <w:right w:w="60" w:type="dxa"/>
+            </w:tcMar>
             <w:tcMar>
               <w:top w:w="40" w:type="dxa"/>
               <w:bottom w:w="40" w:type="dxa"/>
@@ -1118,6 +1322,12 @@
         </w:tc>
         <w:tc>
           <w:tcPr>
+            <w:tcMar>
+              <w:top w:w="40" w:type="dxa"/>
+              <w:bottom w:w="40" w:type="dxa"/>
+              <w:left w:w="60" w:type="dxa"/>
+              <w:right w:w="60" w:type="dxa"/>
+            </w:tcMar>
             <w:tcMar>
               <w:top w:w="40" w:type="dxa"/>
               <w:bottom w:w="40" w:type="dxa"/>
@@ -1176,6 +1386,12 @@
               <w:left w:w="60" w:type="dxa"/>
               <w:right w:w="60" w:type="dxa"/>
             </w:tcMar>
+            <w:tcMar>
+              <w:top w:w="40" w:type="dxa"/>
+              <w:bottom w:w="40" w:type="dxa"/>
+              <w:left w:w="60" w:type="dxa"/>
+              <w:right w:w="60" w:type="dxa"/>
+            </w:tcMar>
           </w:tcPr>
           <w:p>
             <w:pPr>
@@ -1217,6 +1433,12 @@
               <w:left w:w="60" w:type="dxa"/>
               <w:right w:w="60" w:type="dxa"/>
             </w:tcMar>
+            <w:tcMar>
+              <w:top w:w="40" w:type="dxa"/>
+              <w:bottom w:w="40" w:type="dxa"/>
+              <w:left w:w="60" w:type="dxa"/>
+              <w:right w:w="60" w:type="dxa"/>
+            </w:tcMar>
           </w:tcPr>
           <w:p>
             <w:pPr>
@@ -1235,6 +1457,12 @@
         </w:tc>
         <w:tc>
           <w:tcPr>
+            <w:tcMar>
+              <w:top w:w="40" w:type="dxa"/>
+              <w:bottom w:w="40" w:type="dxa"/>
+              <w:left w:w="60" w:type="dxa"/>
+              <w:right w:w="60" w:type="dxa"/>
+            </w:tcMar>
             <w:tcMar>
               <w:top w:w="40" w:type="dxa"/>
               <w:bottom w:w="40" w:type="dxa"/>
@@ -1260,6 +1488,12 @@
         </w:tc>
         <w:tc>
           <w:tcPr>
+            <w:tcMar>
+              <w:top w:w="40" w:type="dxa"/>
+              <w:bottom w:w="40" w:type="dxa"/>
+              <w:left w:w="60" w:type="dxa"/>
+              <w:right w:w="60" w:type="dxa"/>
+            </w:tcMar>
             <w:tcMar>
               <w:top w:w="40" w:type="dxa"/>
               <w:bottom w:w="40" w:type="dxa"/>
@@ -1318,6 +1552,12 @@
               <w:left w:w="60" w:type="dxa"/>
               <w:right w:w="60" w:type="dxa"/>
             </w:tcMar>
+            <w:tcMar>
+              <w:top w:w="40" w:type="dxa"/>
+              <w:bottom w:w="40" w:type="dxa"/>
+              <w:left w:w="60" w:type="dxa"/>
+              <w:right w:w="60" w:type="dxa"/>
+            </w:tcMar>
           </w:tcPr>
           <w:p>
             <w:pPr>
@@ -1330,6 +1570,12 @@
       <w:tr>
         <w:tc>
           <w:tcPr>
+            <w:tcMar>
+              <w:top w:w="40" w:type="dxa"/>
+              <w:bottom w:w="40" w:type="dxa"/>
+              <w:left w:w="60" w:type="dxa"/>
+              <w:right w:w="60" w:type="dxa"/>
+            </w:tcMar>
             <w:tcMar>
               <w:top w:w="40" w:type="dxa"/>
               <w:bottom w:w="40" w:type="dxa"/>
@@ -1354,6 +1600,12 @@
         </w:tc>
         <w:tc>
           <w:tcPr>
+            <w:tcMar>
+              <w:top w:w="40" w:type="dxa"/>
+              <w:bottom w:w="40" w:type="dxa"/>
+              <w:left w:w="60" w:type="dxa"/>
+              <w:right w:w="60" w:type="dxa"/>
+            </w:tcMar>
             <w:tcMar>
               <w:top w:w="40" w:type="dxa"/>
               <w:bottom w:w="40" w:type="dxa"/>
@@ -1385,6 +1637,12 @@
               <w:left w:w="60" w:type="dxa"/>
               <w:right w:w="60" w:type="dxa"/>
             </w:tcMar>
+            <w:tcMar>
+              <w:top w:w="40" w:type="dxa"/>
+              <w:bottom w:w="40" w:type="dxa"/>
+              <w:left w:w="60" w:type="dxa"/>
+              <w:right w:w="60" w:type="dxa"/>
+            </w:tcMar>
           </w:tcPr>
           <w:p>
             <w:pPr>
@@ -1403,6 +1661,12 @@
         </w:tc>
         <w:tc>
           <w:tcPr>
+            <w:tcMar>
+              <w:top w:w="40" w:type="dxa"/>
+              <w:bottom w:w="40" w:type="dxa"/>
+              <w:left w:w="60" w:type="dxa"/>
+              <w:right w:w="60" w:type="dxa"/>
+            </w:tcMar>
             <w:tcMar>
               <w:top w:w="40" w:type="dxa"/>
               <w:bottom w:w="40" w:type="dxa"/>
@@ -1450,6 +1714,12 @@
               <w:left w:w="60" w:type="dxa"/>
               <w:right w:w="60" w:type="dxa"/>
             </w:tcMar>
+            <w:tcMar>
+              <w:top w:w="40" w:type="dxa"/>
+              <w:bottom w:w="40" w:type="dxa"/>
+              <w:left w:w="60" w:type="dxa"/>
+              <w:right w:w="60" w:type="dxa"/>
+            </w:tcMar>
           </w:tcPr>
           <w:p>
             <w:pPr>
@@ -1468,6 +1738,12 @@
         </w:tc>
         <w:tc>
           <w:tcPr>
+            <w:tcMar>
+              <w:top w:w="40" w:type="dxa"/>
+              <w:bottom w:w="40" w:type="dxa"/>
+              <w:left w:w="60" w:type="dxa"/>
+              <w:right w:w="60" w:type="dxa"/>
+            </w:tcMar>
             <w:tcMar>
               <w:top w:w="40" w:type="dxa"/>
               <w:bottom w:w="40" w:type="dxa"/>
@@ -1499,6 +1775,12 @@
               <w:left w:w="60" w:type="dxa"/>
               <w:right w:w="60" w:type="dxa"/>
             </w:tcMar>
+            <w:tcMar>
+              <w:top w:w="40" w:type="dxa"/>
+              <w:bottom w:w="40" w:type="dxa"/>
+              <w:left w:w="60" w:type="dxa"/>
+              <w:right w:w="60" w:type="dxa"/>
+            </w:tcMar>
           </w:tcPr>
           <w:p>
             <w:pPr>
@@ -1517,6 +1799,12 @@
         </w:tc>
         <w:tc>
           <w:tcPr>
+            <w:tcMar>
+              <w:top w:w="40" w:type="dxa"/>
+              <w:bottom w:w="40" w:type="dxa"/>
+              <w:left w:w="60" w:type="dxa"/>
+              <w:right w:w="60" w:type="dxa"/>
+            </w:tcMar>
             <w:tcMar>
               <w:top w:w="40" w:type="dxa"/>
               <w:bottom w:w="40" w:type="dxa"/>
@@ -1550,6 +1838,12 @@
               <w:left w:w="60" w:type="dxa"/>
               <w:right w:w="60" w:type="dxa"/>
             </w:tcMar>
+            <w:tcMar>
+              <w:top w:w="40" w:type="dxa"/>
+              <w:bottom w:w="40" w:type="dxa"/>
+              <w:left w:w="60" w:type="dxa"/>
+              <w:right w:w="60" w:type="dxa"/>
+            </w:tcMar>
           </w:tcPr>
           <w:p>
             <w:pPr>
@@ -1568,6 +1862,12 @@
         </w:tc>
         <w:tc>
           <w:tcPr>
+            <w:tcMar>
+              <w:top w:w="40" w:type="dxa"/>
+              <w:bottom w:w="40" w:type="dxa"/>
+              <w:left w:w="60" w:type="dxa"/>
+              <w:right w:w="60" w:type="dxa"/>
+            </w:tcMar>
             <w:tcMar>
               <w:top w:w="40" w:type="dxa"/>
               <w:bottom w:w="40" w:type="dxa"/>
@@ -1599,6 +1899,12 @@
               <w:left w:w="60" w:type="dxa"/>
               <w:right w:w="60" w:type="dxa"/>
             </w:tcMar>
+            <w:tcMar>
+              <w:top w:w="40" w:type="dxa"/>
+              <w:bottom w:w="40" w:type="dxa"/>
+              <w:left w:w="60" w:type="dxa"/>
+              <w:right w:w="60" w:type="dxa"/>
+            </w:tcMar>
           </w:tcPr>
           <w:p>
             <w:pPr>
@@ -1617,6 +1923,12 @@
         </w:tc>
         <w:tc>
           <w:tcPr>
+            <w:tcMar>
+              <w:top w:w="40" w:type="dxa"/>
+              <w:bottom w:w="40" w:type="dxa"/>
+              <w:left w:w="60" w:type="dxa"/>
+              <w:right w:w="60" w:type="dxa"/>
+            </w:tcMar>
             <w:tcMar>
               <w:top w:w="40" w:type="dxa"/>
               <w:bottom w:w="40" w:type="dxa"/>
@@ -1829,6 +2141,12 @@
               <w:right w:w="60" w:type="dxa"/>
             </w:tcMar>
             <w:shd w:fill="1A365D" w:val="clear"/>
+            <w:tcMar>
+              <w:top w:w="40" w:type="dxa"/>
+              <w:bottom w:w="40" w:type="dxa"/>
+              <w:left w:w="60" w:type="dxa"/>
+              <w:right w:w="60" w:type="dxa"/>
+            </w:tcMar>
           </w:tcPr>
           <w:p>
             <w:pPr>
@@ -1856,6 +2174,12 @@
               <w:right w:w="60" w:type="dxa"/>
             </w:tcMar>
             <w:shd w:fill="1A365D" w:val="clear"/>
+            <w:tcMar>
+              <w:top w:w="40" w:type="dxa"/>
+              <w:bottom w:w="40" w:type="dxa"/>
+              <w:left w:w="60" w:type="dxa"/>
+              <w:right w:w="60" w:type="dxa"/>
+            </w:tcMar>
           </w:tcPr>
           <w:p>
             <w:pPr>
@@ -1883,6 +2207,12 @@
               <w:right w:w="60" w:type="dxa"/>
             </w:tcMar>
             <w:shd w:fill="1A365D" w:val="clear"/>
+            <w:tcMar>
+              <w:top w:w="40" w:type="dxa"/>
+              <w:bottom w:w="40" w:type="dxa"/>
+              <w:left w:w="60" w:type="dxa"/>
+              <w:right w:w="60" w:type="dxa"/>
+            </w:tcMar>
           </w:tcPr>
           <w:p>
             <w:pPr>
@@ -1910,6 +2240,12 @@
               <w:right w:w="60" w:type="dxa"/>
             </w:tcMar>
             <w:shd w:fill="1A365D" w:val="clear"/>
+            <w:tcMar>
+              <w:top w:w="40" w:type="dxa"/>
+              <w:bottom w:w="40" w:type="dxa"/>
+              <w:left w:w="60" w:type="dxa"/>
+              <w:right w:w="60" w:type="dxa"/>
+            </w:tcMar>
           </w:tcPr>
           <w:p>
             <w:pPr>
@@ -1938,6 +2274,12 @@
               <w:left w:w="60" w:type="dxa"/>
               <w:right w:w="60" w:type="dxa"/>
             </w:tcMar>
+            <w:tcMar>
+              <w:top w:w="40" w:type="dxa"/>
+              <w:bottom w:w="40" w:type="dxa"/>
+              <w:left w:w="60" w:type="dxa"/>
+              <w:right w:w="60" w:type="dxa"/>
+            </w:tcMar>
           </w:tcPr>
           <w:p>
             <w:pPr>
@@ -1956,6 +2298,12 @@
         </w:tc>
         <w:tc>
           <w:tcPr>
+            <w:tcMar>
+              <w:top w:w="40" w:type="dxa"/>
+              <w:bottom w:w="40" w:type="dxa"/>
+              <w:left w:w="60" w:type="dxa"/>
+              <w:right w:w="60" w:type="dxa"/>
+            </w:tcMar>
             <w:tcMar>
               <w:top w:w="40" w:type="dxa"/>
               <w:bottom w:w="40" w:type="dxa"/>
@@ -1987,6 +2335,12 @@
               <w:left w:w="60" w:type="dxa"/>
               <w:right w:w="60" w:type="dxa"/>
             </w:tcMar>
+            <w:tcMar>
+              <w:top w:w="40" w:type="dxa"/>
+              <w:bottom w:w="40" w:type="dxa"/>
+              <w:left w:w="60" w:type="dxa"/>
+              <w:right w:w="60" w:type="dxa"/>
+            </w:tcMar>
           </w:tcPr>
           <w:p>
             <w:pPr>
@@ -2005,6 +2359,12 @@
         </w:tc>
         <w:tc>
           <w:tcPr>
+            <w:tcMar>
+              <w:top w:w="40" w:type="dxa"/>
+              <w:bottom w:w="40" w:type="dxa"/>
+              <w:left w:w="60" w:type="dxa"/>
+              <w:right w:w="60" w:type="dxa"/>
+            </w:tcMar>
             <w:tcMar>
               <w:top w:w="40" w:type="dxa"/>
               <w:bottom w:w="40" w:type="dxa"/>
@@ -2038,6 +2398,12 @@
               <w:left w:w="60" w:type="dxa"/>
               <w:right w:w="60" w:type="dxa"/>
             </w:tcMar>
+            <w:tcMar>
+              <w:top w:w="40" w:type="dxa"/>
+              <w:bottom w:w="40" w:type="dxa"/>
+              <w:left w:w="60" w:type="dxa"/>
+              <w:right w:w="60" w:type="dxa"/>
+            </w:tcMar>
           </w:tcPr>
           <w:p>
             <w:pPr>
@@ -2056,6 +2422,12 @@
         </w:tc>
         <w:tc>
           <w:tcPr>
+            <w:tcMar>
+              <w:top w:w="40" w:type="dxa"/>
+              <w:bottom w:w="40" w:type="dxa"/>
+              <w:left w:w="60" w:type="dxa"/>
+              <w:right w:w="60" w:type="dxa"/>
+            </w:tcMar>
             <w:tcMar>
               <w:top w:w="40" w:type="dxa"/>
               <w:bottom w:w="40" w:type="dxa"/>
@@ -2081,6 +2453,12 @@
         </w:tc>
         <w:tc>
           <w:tcPr>
+            <w:tcMar>
+              <w:top w:w="40" w:type="dxa"/>
+              <w:bottom w:w="40" w:type="dxa"/>
+              <w:left w:w="60" w:type="dxa"/>
+              <w:right w:w="60" w:type="dxa"/>
+            </w:tcMar>
             <w:tcMar>
               <w:top w:w="40" w:type="dxa"/>
               <w:bottom w:w="40" w:type="dxa"/>
@@ -2139,6 +2517,12 @@
               <w:left w:w="60" w:type="dxa"/>
               <w:right w:w="60" w:type="dxa"/>
             </w:tcMar>
+            <w:tcMar>
+              <w:top w:w="40" w:type="dxa"/>
+              <w:bottom w:w="40" w:type="dxa"/>
+              <w:left w:w="60" w:type="dxa"/>
+              <w:right w:w="60" w:type="dxa"/>
+            </w:tcMar>
           </w:tcPr>
           <w:p>
             <w:pPr>
@@ -2165,6 +2549,12 @@
               <w:left w:w="60" w:type="dxa"/>
               <w:right w:w="60" w:type="dxa"/>
             </w:tcMar>
+            <w:tcMar>
+              <w:top w:w="40" w:type="dxa"/>
+              <w:bottom w:w="40" w:type="dxa"/>
+              <w:left w:w="60" w:type="dxa"/>
+              <w:right w:w="60" w:type="dxa"/>
+            </w:tcMar>
           </w:tcPr>
           <w:p>
             <w:pPr>
@@ -2183,6 +2573,12 @@
         </w:tc>
         <w:tc>
           <w:tcPr>
+            <w:tcMar>
+              <w:top w:w="40" w:type="dxa"/>
+              <w:bottom w:w="40" w:type="dxa"/>
+              <w:left w:w="60" w:type="dxa"/>
+              <w:right w:w="60" w:type="dxa"/>
+            </w:tcMar>
             <w:tcMar>
               <w:top w:w="40" w:type="dxa"/>
               <w:bottom w:w="40" w:type="dxa"/>
@@ -2208,6 +2604,12 @@
         </w:tc>
         <w:tc>
           <w:tcPr>
+            <w:tcMar>
+              <w:top w:w="40" w:type="dxa"/>
+              <w:bottom w:w="40" w:type="dxa"/>
+              <w:left w:w="60" w:type="dxa"/>
+              <w:right w:w="60" w:type="dxa"/>
+            </w:tcMar>
             <w:tcMar>
               <w:top w:w="40" w:type="dxa"/>
               <w:bottom w:w="40" w:type="dxa"/>
@@ -2266,6 +2668,12 @@
               <w:left w:w="60" w:type="dxa"/>
               <w:right w:w="60" w:type="dxa"/>
             </w:tcMar>
+            <w:tcMar>
+              <w:top w:w="40" w:type="dxa"/>
+              <w:bottom w:w="40" w:type="dxa"/>
+              <w:left w:w="60" w:type="dxa"/>
+              <w:right w:w="60" w:type="dxa"/>
+            </w:tcMar>
           </w:tcPr>
           <w:p>
             <w:pPr>
@@ -2278,6 +2686,12 @@
       <w:tr>
         <w:tc>
           <w:tcPr>
+            <w:tcMar>
+              <w:top w:w="40" w:type="dxa"/>
+              <w:bottom w:w="40" w:type="dxa"/>
+              <w:left w:w="60" w:type="dxa"/>
+              <w:right w:w="60" w:type="dxa"/>
+            </w:tcMar>
             <w:tcMar>
               <w:top w:w="40" w:type="dxa"/>
               <w:bottom w:w="40" w:type="dxa"/>
@@ -2302,6 +2716,12 @@
         </w:tc>
         <w:tc>
           <w:tcPr>
+            <w:tcMar>
+              <w:top w:w="40" w:type="dxa"/>
+              <w:bottom w:w="40" w:type="dxa"/>
+              <w:left w:w="60" w:type="dxa"/>
+              <w:right w:w="60" w:type="dxa"/>
+            </w:tcMar>
             <w:tcMar>
               <w:top w:w="40" w:type="dxa"/>
               <w:bottom w:w="40" w:type="dxa"/>
@@ -2327,6 +2747,12 @@
         </w:tc>
         <w:tc>
           <w:tcPr>
+            <w:tcMar>
+              <w:top w:w="40" w:type="dxa"/>
+              <w:bottom w:w="40" w:type="dxa"/>
+              <w:left w:w="60" w:type="dxa"/>
+              <w:right w:w="60" w:type="dxa"/>
+            </w:tcMar>
             <w:tcMar>
               <w:top w:w="40" w:type="dxa"/>
               <w:bottom w:w="40" w:type="dxa"/>
@@ -2385,6 +2811,12 @@
               <w:left w:w="60" w:type="dxa"/>
               <w:right w:w="60" w:type="dxa"/>
             </w:tcMar>
+            <w:tcMar>
+              <w:top w:w="40" w:type="dxa"/>
+              <w:bottom w:w="40" w:type="dxa"/>
+              <w:left w:w="60" w:type="dxa"/>
+              <w:right w:w="60" w:type="dxa"/>
+            </w:tcMar>
           </w:tcPr>
           <w:p>
             <w:pPr>
@@ -2426,6 +2858,12 @@
               <w:left w:w="60" w:type="dxa"/>
               <w:right w:w="60" w:type="dxa"/>
             </w:tcMar>
+            <w:tcMar>
+              <w:top w:w="40" w:type="dxa"/>
+              <w:bottom w:w="40" w:type="dxa"/>
+              <w:left w:w="60" w:type="dxa"/>
+              <w:right w:w="60" w:type="dxa"/>
+            </w:tcMar>
           </w:tcPr>
           <w:p>
             <w:pPr>
@@ -2444,6 +2882,12 @@
         </w:tc>
         <w:tc>
           <w:tcPr>
+            <w:tcMar>
+              <w:top w:w="40" w:type="dxa"/>
+              <w:bottom w:w="40" w:type="dxa"/>
+              <w:left w:w="60" w:type="dxa"/>
+              <w:right w:w="60" w:type="dxa"/>
+            </w:tcMar>
             <w:tcMar>
               <w:top w:w="40" w:type="dxa"/>
               <w:bottom w:w="40" w:type="dxa"/>
@@ -2469,6 +2913,12 @@
         </w:tc>
         <w:tc>
           <w:tcPr>
+            <w:tcMar>
+              <w:top w:w="40" w:type="dxa"/>
+              <w:bottom w:w="40" w:type="dxa"/>
+              <w:left w:w="60" w:type="dxa"/>
+              <w:right w:w="60" w:type="dxa"/>
+            </w:tcMar>
             <w:tcMar>
               <w:top w:w="40" w:type="dxa"/>
               <w:bottom w:w="40" w:type="dxa"/>
@@ -2527,6 +2977,12 @@
               <w:left w:w="60" w:type="dxa"/>
               <w:right w:w="60" w:type="dxa"/>
             </w:tcMar>
+            <w:tcMar>
+              <w:top w:w="40" w:type="dxa"/>
+              <w:bottom w:w="40" w:type="dxa"/>
+              <w:left w:w="60" w:type="dxa"/>
+              <w:right w:w="60" w:type="dxa"/>
+            </w:tcMar>
           </w:tcPr>
           <w:p>
             <w:pPr>
@@ -2568,6 +3024,12 @@
               <w:left w:w="60" w:type="dxa"/>
               <w:right w:w="60" w:type="dxa"/>
             </w:tcMar>
+            <w:tcMar>
+              <w:top w:w="40" w:type="dxa"/>
+              <w:bottom w:w="40" w:type="dxa"/>
+              <w:left w:w="60" w:type="dxa"/>
+              <w:right w:w="60" w:type="dxa"/>
+            </w:tcMar>
           </w:tcPr>
           <w:p>
             <w:pPr>
@@ -2586,6 +3048,12 @@
         </w:tc>
         <w:tc>
           <w:tcPr>
+            <w:tcMar>
+              <w:top w:w="40" w:type="dxa"/>
+              <w:bottom w:w="40" w:type="dxa"/>
+              <w:left w:w="60" w:type="dxa"/>
+              <w:right w:w="60" w:type="dxa"/>
+            </w:tcMar>
             <w:tcMar>
               <w:top w:w="40" w:type="dxa"/>
               <w:bottom w:w="40" w:type="dxa"/>
@@ -2617,6 +3085,12 @@
               <w:left w:w="60" w:type="dxa"/>
               <w:right w:w="60" w:type="dxa"/>
             </w:tcMar>
+            <w:tcMar>
+              <w:top w:w="40" w:type="dxa"/>
+              <w:bottom w:w="40" w:type="dxa"/>
+              <w:left w:w="60" w:type="dxa"/>
+              <w:right w:w="60" w:type="dxa"/>
+            </w:tcMar>
           </w:tcPr>
           <w:p>
             <w:pPr>
@@ -2635,6 +3109,12 @@
         </w:tc>
         <w:tc>
           <w:tcPr>
+            <w:tcMar>
+              <w:top w:w="40" w:type="dxa"/>
+              <w:bottom w:w="40" w:type="dxa"/>
+              <w:left w:w="60" w:type="dxa"/>
+              <w:right w:w="60" w:type="dxa"/>
+            </w:tcMar>
             <w:tcMar>
               <w:top w:w="40" w:type="dxa"/>
               <w:bottom w:w="40" w:type="dxa"/>
@@ -2668,6 +3148,12 @@
               <w:left w:w="60" w:type="dxa"/>
               <w:right w:w="60" w:type="dxa"/>
             </w:tcMar>
+            <w:tcMar>
+              <w:top w:w="40" w:type="dxa"/>
+              <w:bottom w:w="40" w:type="dxa"/>
+              <w:left w:w="60" w:type="dxa"/>
+              <w:right w:w="60" w:type="dxa"/>
+            </w:tcMar>
           </w:tcPr>
           <w:p>
             <w:pPr>
@@ -2686,6 +3172,12 @@
         </w:tc>
         <w:tc>
           <w:tcPr>
+            <w:tcMar>
+              <w:top w:w="40" w:type="dxa"/>
+              <w:bottom w:w="40" w:type="dxa"/>
+              <w:left w:w="60" w:type="dxa"/>
+              <w:right w:w="60" w:type="dxa"/>
+            </w:tcMar>
             <w:tcMar>
               <w:top w:w="40" w:type="dxa"/>
               <w:bottom w:w="40" w:type="dxa"/>
@@ -2717,6 +3209,12 @@
               <w:left w:w="60" w:type="dxa"/>
               <w:right w:w="60" w:type="dxa"/>
             </w:tcMar>
+            <w:tcMar>
+              <w:top w:w="40" w:type="dxa"/>
+              <w:bottom w:w="40" w:type="dxa"/>
+              <w:left w:w="60" w:type="dxa"/>
+              <w:right w:w="60" w:type="dxa"/>
+            </w:tcMar>
           </w:tcPr>
           <w:p>
             <w:pPr>
@@ -2735,6 +3233,12 @@
         </w:tc>
         <w:tc>
           <w:tcPr>
+            <w:tcMar>
+              <w:top w:w="40" w:type="dxa"/>
+              <w:bottom w:w="40" w:type="dxa"/>
+              <w:left w:w="60" w:type="dxa"/>
+              <w:right w:w="60" w:type="dxa"/>
+            </w:tcMar>
             <w:tcMar>
               <w:top w:w="40" w:type="dxa"/>
               <w:bottom w:w="40" w:type="dxa"/>
@@ -3187,6 +3691,12 @@
               <w:right w:w="60" w:type="dxa"/>
             </w:tcMar>
             <w:shd w:fill="1A365D" w:val="clear"/>
+            <w:tcMar>
+              <w:top w:w="40" w:type="dxa"/>
+              <w:bottom w:w="40" w:type="dxa"/>
+              <w:left w:w="60" w:type="dxa"/>
+              <w:right w:w="60" w:type="dxa"/>
+            </w:tcMar>
           </w:tcPr>
           <w:p>
             <w:pPr>
@@ -3214,6 +3724,12 @@
               <w:right w:w="60" w:type="dxa"/>
             </w:tcMar>
             <w:shd w:fill="1A365D" w:val="clear"/>
+            <w:tcMar>
+              <w:top w:w="40" w:type="dxa"/>
+              <w:bottom w:w="40" w:type="dxa"/>
+              <w:left w:w="60" w:type="dxa"/>
+              <w:right w:w="60" w:type="dxa"/>
+            </w:tcMar>
           </w:tcPr>
           <w:p>
             <w:pPr>
@@ -3241,6 +3757,12 @@
               <w:right w:w="60" w:type="dxa"/>
             </w:tcMar>
             <w:shd w:fill="1A365D" w:val="clear"/>
+            <w:tcMar>
+              <w:top w:w="40" w:type="dxa"/>
+              <w:bottom w:w="40" w:type="dxa"/>
+              <w:left w:w="60" w:type="dxa"/>
+              <w:right w:w="60" w:type="dxa"/>
+            </w:tcMar>
           </w:tcPr>
           <w:p>
             <w:pPr>
@@ -3268,6 +3790,12 @@
               <w:right w:w="60" w:type="dxa"/>
             </w:tcMar>
             <w:shd w:fill="1A365D" w:val="clear"/>
+            <w:tcMar>
+              <w:top w:w="40" w:type="dxa"/>
+              <w:bottom w:w="40" w:type="dxa"/>
+              <w:left w:w="60" w:type="dxa"/>
+              <w:right w:w="60" w:type="dxa"/>
+            </w:tcMar>
           </w:tcPr>
           <w:p>
             <w:pPr>
@@ -3296,6 +3824,12 @@
               <w:left w:w="60" w:type="dxa"/>
               <w:right w:w="60" w:type="dxa"/>
             </w:tcMar>
+            <w:tcMar>
+              <w:top w:w="40" w:type="dxa"/>
+              <w:bottom w:w="40" w:type="dxa"/>
+              <w:left w:w="60" w:type="dxa"/>
+              <w:right w:w="60" w:type="dxa"/>
+            </w:tcMar>
           </w:tcPr>
           <w:p>
             <w:pPr>
@@ -3314,6 +3848,12 @@
         </w:tc>
         <w:tc>
           <w:tcPr>
+            <w:tcMar>
+              <w:top w:w="40" w:type="dxa"/>
+              <w:bottom w:w="40" w:type="dxa"/>
+              <w:left w:w="60" w:type="dxa"/>
+              <w:right w:w="60" w:type="dxa"/>
+            </w:tcMar>
             <w:tcMar>
               <w:top w:w="40" w:type="dxa"/>
               <w:bottom w:w="40" w:type="dxa"/>
@@ -3339,6 +3879,12 @@
         </w:tc>
         <w:tc>
           <w:tcPr>
+            <w:tcMar>
+              <w:top w:w="40" w:type="dxa"/>
+              <w:bottom w:w="40" w:type="dxa"/>
+              <w:left w:w="60" w:type="dxa"/>
+              <w:right w:w="60" w:type="dxa"/>
+            </w:tcMar>
             <w:tcMar>
               <w:top w:w="40" w:type="dxa"/>
               <w:bottom w:w="40" w:type="dxa"/>
@@ -3383,6 +3929,12 @@
               <w:left w:w="60" w:type="dxa"/>
               <w:right w:w="60" w:type="dxa"/>
             </w:tcMar>
+            <w:tcMar>
+              <w:top w:w="40" w:type="dxa"/>
+              <w:bottom w:w="40" w:type="dxa"/>
+              <w:left w:w="60" w:type="dxa"/>
+              <w:right w:w="60" w:type="dxa"/>
+            </w:tcMar>
           </w:tcPr>
           <w:p>
             <w:pPr>
@@ -3410,6 +3962,12 @@
               <w:left w:w="60" w:type="dxa"/>
               <w:right w:w="60" w:type="dxa"/>
             </w:tcMar>
+            <w:tcMar>
+              <w:top w:w="40" w:type="dxa"/>
+              <w:bottom w:w="40" w:type="dxa"/>
+              <w:left w:w="60" w:type="dxa"/>
+              <w:right w:w="60" w:type="dxa"/>
+            </w:tcMar>
           </w:tcPr>
           <w:p>
             <w:pPr>
@@ -3428,6 +3986,12 @@
         </w:tc>
         <w:tc>
           <w:tcPr>
+            <w:tcMar>
+              <w:top w:w="40" w:type="dxa"/>
+              <w:bottom w:w="40" w:type="dxa"/>
+              <w:left w:w="60" w:type="dxa"/>
+              <w:right w:w="60" w:type="dxa"/>
+            </w:tcMar>
             <w:tcMar>
               <w:top w:w="40" w:type="dxa"/>
               <w:bottom w:w="40" w:type="dxa"/>
@@ -3453,6 +4017,12 @@
         </w:tc>
         <w:tc>
           <w:tcPr>
+            <w:tcMar>
+              <w:top w:w="40" w:type="dxa"/>
+              <w:bottom w:w="40" w:type="dxa"/>
+              <w:left w:w="60" w:type="dxa"/>
+              <w:right w:w="60" w:type="dxa"/>
+            </w:tcMar>
             <w:tcMar>
               <w:top w:w="40" w:type="dxa"/>
               <w:bottom w:w="40" w:type="dxa"/>
@@ -3491,6 +4061,12 @@
         </w:tc>
         <w:tc>
           <w:tcPr>
+            <w:tcMar>
+              <w:top w:w="40" w:type="dxa"/>
+              <w:bottom w:w="40" w:type="dxa"/>
+              <w:left w:w="60" w:type="dxa"/>
+              <w:right w:w="60" w:type="dxa"/>
+            </w:tcMar>
             <w:tcMar>
               <w:top w:w="40" w:type="dxa"/>
               <w:bottom w:w="40" w:type="dxa"/>
@@ -3724,6 +4300,12 @@
               <w:right w:w="60" w:type="dxa"/>
             </w:tcMar>
             <w:shd w:fill="1A365D" w:val="clear"/>
+            <w:tcMar>
+              <w:top w:w="40" w:type="dxa"/>
+              <w:bottom w:w="40" w:type="dxa"/>
+              <w:left w:w="60" w:type="dxa"/>
+              <w:right w:w="60" w:type="dxa"/>
+            </w:tcMar>
           </w:tcPr>
           <w:p>
             <w:pPr>
@@ -3751,6 +4333,12 @@
               <w:right w:w="60" w:type="dxa"/>
             </w:tcMar>
             <w:shd w:fill="1A365D" w:val="clear"/>
+            <w:tcMar>
+              <w:top w:w="40" w:type="dxa"/>
+              <w:bottom w:w="40" w:type="dxa"/>
+              <w:left w:w="60" w:type="dxa"/>
+              <w:right w:w="60" w:type="dxa"/>
+            </w:tcMar>
           </w:tcPr>
           <w:p>
             <w:pPr>
@@ -3778,6 +4366,12 @@
               <w:right w:w="60" w:type="dxa"/>
             </w:tcMar>
             <w:shd w:fill="1A365D" w:val="clear"/>
+            <w:tcMar>
+              <w:top w:w="40" w:type="dxa"/>
+              <w:bottom w:w="40" w:type="dxa"/>
+              <w:left w:w="60" w:type="dxa"/>
+              <w:right w:w="60" w:type="dxa"/>
+            </w:tcMar>
           </w:tcPr>
           <w:p>
             <w:pPr>
@@ -3805,6 +4399,12 @@
               <w:right w:w="60" w:type="dxa"/>
             </w:tcMar>
             <w:shd w:fill="1A365D" w:val="clear"/>
+            <w:tcMar>
+              <w:top w:w="40" w:type="dxa"/>
+              <w:bottom w:w="40" w:type="dxa"/>
+              <w:left w:w="60" w:type="dxa"/>
+              <w:right w:w="60" w:type="dxa"/>
+            </w:tcMar>
           </w:tcPr>
           <w:p>
             <w:pPr>
@@ -3833,6 +4433,12 @@
               <w:left w:w="60" w:type="dxa"/>
               <w:right w:w="60" w:type="dxa"/>
             </w:tcMar>
+            <w:tcMar>
+              <w:top w:w="40" w:type="dxa"/>
+              <w:bottom w:w="40" w:type="dxa"/>
+              <w:left w:w="60" w:type="dxa"/>
+              <w:right w:w="60" w:type="dxa"/>
+            </w:tcMar>
           </w:tcPr>
           <w:p>
             <w:pPr>
@@ -3851,6 +4457,12 @@
         </w:tc>
         <w:tc>
           <w:tcPr>
+            <w:tcMar>
+              <w:top w:w="40" w:type="dxa"/>
+              <w:bottom w:w="40" w:type="dxa"/>
+              <w:left w:w="60" w:type="dxa"/>
+              <w:right w:w="60" w:type="dxa"/>
+            </w:tcMar>
             <w:tcMar>
               <w:top w:w="40" w:type="dxa"/>
               <w:bottom w:w="40" w:type="dxa"/>
@@ -3882,6 +4494,12 @@
               <w:left w:w="60" w:type="dxa"/>
               <w:right w:w="60" w:type="dxa"/>
             </w:tcMar>
+            <w:tcMar>
+              <w:top w:w="40" w:type="dxa"/>
+              <w:bottom w:w="40" w:type="dxa"/>
+              <w:left w:w="60" w:type="dxa"/>
+              <w:right w:w="60" w:type="dxa"/>
+            </w:tcMar>
           </w:tcPr>
           <w:p>
             <w:pPr>
@@ -3906,6 +4524,12 @@
               <w:left w:w="60" w:type="dxa"/>
               <w:right w:w="60" w:type="dxa"/>
             </w:tcMar>
+            <w:tcMar>
+              <w:top w:w="40" w:type="dxa"/>
+              <w:bottom w:w="40" w:type="dxa"/>
+              <w:left w:w="60" w:type="dxa"/>
+              <w:right w:w="60" w:type="dxa"/>
+            </w:tcMar>
           </w:tcPr>
           <w:p>
             <w:pPr>
@@ -3918,6 +4542,12 @@
       <w:tr>
         <w:tc>
           <w:tcPr>
+            <w:tcMar>
+              <w:top w:w="40" w:type="dxa"/>
+              <w:bottom w:w="40" w:type="dxa"/>
+              <w:left w:w="60" w:type="dxa"/>
+              <w:right w:w="60" w:type="dxa"/>
+            </w:tcMar>
             <w:tcMar>
               <w:top w:w="40" w:type="dxa"/>
               <w:bottom w:w="40" w:type="dxa"/>
@@ -3942,6 +4572,12 @@
         </w:tc>
         <w:tc>
           <w:tcPr>
+            <w:tcMar>
+              <w:top w:w="40" w:type="dxa"/>
+              <w:bottom w:w="40" w:type="dxa"/>
+              <w:left w:w="60" w:type="dxa"/>
+              <w:right w:w="60" w:type="dxa"/>
+            </w:tcMar>
             <w:tcMar>
               <w:top w:w="40" w:type="dxa"/>
               <w:bottom w:w="40" w:type="dxa"/>
@@ -3973,6 +4609,12 @@
               <w:left w:w="60" w:type="dxa"/>
               <w:right w:w="60" w:type="dxa"/>
             </w:tcMar>
+            <w:tcMar>
+              <w:top w:w="40" w:type="dxa"/>
+              <w:bottom w:w="40" w:type="dxa"/>
+              <w:left w:w="60" w:type="dxa"/>
+              <w:right w:w="60" w:type="dxa"/>
+            </w:tcMar>
           </w:tcPr>
           <w:p>
             <w:pPr>
@@ -3997,6 +4639,12 @@
               <w:left w:w="60" w:type="dxa"/>
               <w:right w:w="60" w:type="dxa"/>
             </w:tcMar>
+            <w:tcMar>
+              <w:top w:w="40" w:type="dxa"/>
+              <w:bottom w:w="40" w:type="dxa"/>
+              <w:left w:w="60" w:type="dxa"/>
+              <w:right w:w="60" w:type="dxa"/>
+            </w:tcMar>
           </w:tcPr>
           <w:p>
             <w:pPr>
@@ -4009,6 +4657,12 @@
       <w:tr>
         <w:tc>
           <w:tcPr>
+            <w:tcMar>
+              <w:top w:w="40" w:type="dxa"/>
+              <w:bottom w:w="40" w:type="dxa"/>
+              <w:left w:w="60" w:type="dxa"/>
+              <w:right w:w="60" w:type="dxa"/>
+            </w:tcMar>
             <w:tcMar>
               <w:top w:w="40" w:type="dxa"/>
               <w:bottom w:w="40" w:type="dxa"/>
@@ -4033,6 +4687,12 @@
         </w:tc>
         <w:tc>
           <w:tcPr>
+            <w:tcMar>
+              <w:top w:w="40" w:type="dxa"/>
+              <w:bottom w:w="40" w:type="dxa"/>
+              <w:left w:w="60" w:type="dxa"/>
+              <w:right w:w="60" w:type="dxa"/>
+            </w:tcMar>
             <w:tcMar>
               <w:top w:w="40" w:type="dxa"/>
               <w:bottom w:w="40" w:type="dxa"/>
@@ -4064,6 +4724,12 @@
               <w:left w:w="60" w:type="dxa"/>
               <w:right w:w="60" w:type="dxa"/>
             </w:tcMar>
+            <w:tcMar>
+              <w:top w:w="40" w:type="dxa"/>
+              <w:bottom w:w="40" w:type="dxa"/>
+              <w:left w:w="60" w:type="dxa"/>
+              <w:right w:w="60" w:type="dxa"/>
+            </w:tcMar>
           </w:tcPr>
           <w:p>
             <w:pPr>
@@ -4082,6 +4748,12 @@
         </w:tc>
         <w:tc>
           <w:tcPr>
+            <w:tcMar>
+              <w:top w:w="40" w:type="dxa"/>
+              <w:bottom w:w="40" w:type="dxa"/>
+              <w:left w:w="60" w:type="dxa"/>
+              <w:right w:w="60" w:type="dxa"/>
+            </w:tcMar>
             <w:tcMar>
               <w:top w:w="40" w:type="dxa"/>
               <w:bottom w:w="40" w:type="dxa"/>
@@ -4141,6 +4813,12 @@
               <w:right w:w="60" w:type="dxa"/>
             </w:tcMar>
             <w:shd w:fill="1A365D" w:val="clear"/>
+            <w:tcMar>
+              <w:top w:w="40" w:type="dxa"/>
+              <w:bottom w:w="40" w:type="dxa"/>
+              <w:left w:w="60" w:type="dxa"/>
+              <w:right w:w="60" w:type="dxa"/>
+            </w:tcMar>
           </w:tcPr>
           <w:p>
             <w:pPr>
@@ -4168,6 +4846,12 @@
               <w:right w:w="60" w:type="dxa"/>
             </w:tcMar>
             <w:shd w:fill="1A365D" w:val="clear"/>
+            <w:tcMar>
+              <w:top w:w="40" w:type="dxa"/>
+              <w:bottom w:w="40" w:type="dxa"/>
+              <w:left w:w="60" w:type="dxa"/>
+              <w:right w:w="60" w:type="dxa"/>
+            </w:tcMar>
           </w:tcPr>
           <w:p>
             <w:pPr>
@@ -4195,6 +4879,12 @@
               <w:right w:w="60" w:type="dxa"/>
             </w:tcMar>
             <w:shd w:fill="1A365D" w:val="clear"/>
+            <w:tcMar>
+              <w:top w:w="40" w:type="dxa"/>
+              <w:bottom w:w="40" w:type="dxa"/>
+              <w:left w:w="60" w:type="dxa"/>
+              <w:right w:w="60" w:type="dxa"/>
+            </w:tcMar>
           </w:tcPr>
           <w:p>
             <w:pPr>
@@ -4223,6 +4913,12 @@
               <w:left w:w="60" w:type="dxa"/>
               <w:right w:w="60" w:type="dxa"/>
             </w:tcMar>
+            <w:tcMar>
+              <w:top w:w="40" w:type="dxa"/>
+              <w:bottom w:w="40" w:type="dxa"/>
+              <w:left w:w="60" w:type="dxa"/>
+              <w:right w:w="60" w:type="dxa"/>
+            </w:tcMar>
           </w:tcPr>
           <w:p>
             <w:pPr>
@@ -4241,6 +4937,12 @@
         </w:tc>
         <w:tc>
           <w:tcPr>
+            <w:tcMar>
+              <w:top w:w="40" w:type="dxa"/>
+              <w:bottom w:w="40" w:type="dxa"/>
+              <w:left w:w="60" w:type="dxa"/>
+              <w:right w:w="60" w:type="dxa"/>
+            </w:tcMar>
             <w:tcMar>
               <w:top w:w="40" w:type="dxa"/>
               <w:bottom w:w="40" w:type="dxa"/>
@@ -4266,6 +4968,12 @@
         </w:tc>
         <w:tc>
           <w:tcPr>
+            <w:tcMar>
+              <w:top w:w="40" w:type="dxa"/>
+              <w:bottom w:w="40" w:type="dxa"/>
+              <w:left w:w="60" w:type="dxa"/>
+              <w:right w:w="60" w:type="dxa"/>
+            </w:tcMar>
             <w:tcMar>
               <w:top w:w="40" w:type="dxa"/>
               <w:bottom w:w="40" w:type="dxa"/>
@@ -4394,6 +5102,12 @@
               <w:right w:w="60" w:type="dxa"/>
             </w:tcMar>
             <w:shd w:fill="1A365D" w:val="clear"/>
+            <w:tcMar>
+              <w:top w:w="40" w:type="dxa"/>
+              <w:bottom w:w="40" w:type="dxa"/>
+              <w:left w:w="60" w:type="dxa"/>
+              <w:right w:w="60" w:type="dxa"/>
+            </w:tcMar>
           </w:tcPr>
           <w:p>
             <w:pPr>
@@ -4421,6 +5135,12 @@
               <w:right w:w="60" w:type="dxa"/>
             </w:tcMar>
             <w:shd w:fill="1A365D" w:val="clear"/>
+            <w:tcMar>
+              <w:top w:w="40" w:type="dxa"/>
+              <w:bottom w:w="40" w:type="dxa"/>
+              <w:left w:w="60" w:type="dxa"/>
+              <w:right w:w="60" w:type="dxa"/>
+            </w:tcMar>
           </w:tcPr>
           <w:p>
             <w:pPr>
@@ -4449,6 +5169,12 @@
               <w:left w:w="60" w:type="dxa"/>
               <w:right w:w="60" w:type="dxa"/>
             </w:tcMar>
+            <w:tcMar>
+              <w:top w:w="40" w:type="dxa"/>
+              <w:bottom w:w="40" w:type="dxa"/>
+              <w:left w:w="60" w:type="dxa"/>
+              <w:right w:w="60" w:type="dxa"/>
+            </w:tcMar>
           </w:tcPr>
           <w:p>
             <w:pPr>
@@ -4467,6 +5193,12 @@
         </w:tc>
         <w:tc>
           <w:tcPr>
+            <w:tcMar>
+              <w:top w:w="40" w:type="dxa"/>
+              <w:bottom w:w="40" w:type="dxa"/>
+              <w:left w:w="60" w:type="dxa"/>
+              <w:right w:w="60" w:type="dxa"/>
+            </w:tcMar>
             <w:tcMar>
               <w:top w:w="40" w:type="dxa"/>
               <w:bottom w:w="40" w:type="dxa"/>
@@ -4500,6 +5232,12 @@
               <w:left w:w="60" w:type="dxa"/>
               <w:right w:w="60" w:type="dxa"/>
             </w:tcMar>
+            <w:tcMar>
+              <w:top w:w="40" w:type="dxa"/>
+              <w:bottom w:w="40" w:type="dxa"/>
+              <w:left w:w="60" w:type="dxa"/>
+              <w:right w:w="60" w:type="dxa"/>
+            </w:tcMar>
           </w:tcPr>
           <w:p>
             <w:pPr>
@@ -4518,6 +5256,12 @@
         </w:tc>
         <w:tc>
           <w:tcPr>
+            <w:tcMar>
+              <w:top w:w="40" w:type="dxa"/>
+              <w:bottom w:w="40" w:type="dxa"/>
+              <w:left w:w="60" w:type="dxa"/>
+              <w:right w:w="60" w:type="dxa"/>
+            </w:tcMar>
             <w:tcMar>
               <w:top w:w="40" w:type="dxa"/>
               <w:bottom w:w="40" w:type="dxa"/>
@@ -4551,6 +5295,12 @@
               <w:left w:w="60" w:type="dxa"/>
               <w:right w:w="60" w:type="dxa"/>
             </w:tcMar>
+            <w:tcMar>
+              <w:top w:w="40" w:type="dxa"/>
+              <w:bottom w:w="40" w:type="dxa"/>
+              <w:left w:w="60" w:type="dxa"/>
+              <w:right w:w="60" w:type="dxa"/>
+            </w:tcMar>
           </w:tcPr>
           <w:p>
             <w:pPr>
@@ -4569,6 +5319,12 @@
         </w:tc>
         <w:tc>
           <w:tcPr>
+            <w:tcMar>
+              <w:top w:w="40" w:type="dxa"/>
+              <w:bottom w:w="40" w:type="dxa"/>
+              <w:left w:w="60" w:type="dxa"/>
+              <w:right w:w="60" w:type="dxa"/>
+            </w:tcMar>
             <w:tcMar>
               <w:top w:w="40" w:type="dxa"/>
               <w:bottom w:w="40" w:type="dxa"/>
@@ -4602,6 +5358,12 @@
               <w:left w:w="60" w:type="dxa"/>
               <w:right w:w="60" w:type="dxa"/>
             </w:tcMar>
+            <w:tcMar>
+              <w:top w:w="40" w:type="dxa"/>
+              <w:bottom w:w="40" w:type="dxa"/>
+              <w:left w:w="60" w:type="dxa"/>
+              <w:right w:w="60" w:type="dxa"/>
+            </w:tcMar>
           </w:tcPr>
           <w:p>
             <w:pPr>
@@ -4620,6 +5382,12 @@
         </w:tc>
         <w:tc>
           <w:tcPr>
+            <w:tcMar>
+              <w:top w:w="40" w:type="dxa"/>
+              <w:bottom w:w="40" w:type="dxa"/>
+              <w:left w:w="60" w:type="dxa"/>
+              <w:right w:w="60" w:type="dxa"/>
+            </w:tcMar>
             <w:tcMar>
               <w:top w:w="40" w:type="dxa"/>
               <w:bottom w:w="40" w:type="dxa"/>
@@ -4653,6 +5421,12 @@
               <w:left w:w="60" w:type="dxa"/>
               <w:right w:w="60" w:type="dxa"/>
             </w:tcMar>
+            <w:tcMar>
+              <w:top w:w="40" w:type="dxa"/>
+              <w:bottom w:w="40" w:type="dxa"/>
+              <w:left w:w="60" w:type="dxa"/>
+              <w:right w:w="60" w:type="dxa"/>
+            </w:tcMar>
           </w:tcPr>
           <w:p>
             <w:pPr>
@@ -4671,6 +5445,12 @@
         </w:tc>
         <w:tc>
           <w:tcPr>
+            <w:tcMar>
+              <w:top w:w="40" w:type="dxa"/>
+              <w:bottom w:w="40" w:type="dxa"/>
+              <w:left w:w="60" w:type="dxa"/>
+              <w:right w:w="60" w:type="dxa"/>
+            </w:tcMar>
             <w:tcMar>
               <w:top w:w="40" w:type="dxa"/>
               <w:bottom w:w="40" w:type="dxa"/>
@@ -4704,6 +5484,12 @@
               <w:left w:w="60" w:type="dxa"/>
               <w:right w:w="60" w:type="dxa"/>
             </w:tcMar>
+            <w:tcMar>
+              <w:top w:w="40" w:type="dxa"/>
+              <w:bottom w:w="40" w:type="dxa"/>
+              <w:left w:w="60" w:type="dxa"/>
+              <w:right w:w="60" w:type="dxa"/>
+            </w:tcMar>
           </w:tcPr>
           <w:p>
             <w:pPr>
@@ -4722,6 +5508,12 @@
         </w:tc>
         <w:tc>
           <w:tcPr>
+            <w:tcMar>
+              <w:top w:w="40" w:type="dxa"/>
+              <w:bottom w:w="40" w:type="dxa"/>
+              <w:left w:w="60" w:type="dxa"/>
+              <w:right w:w="60" w:type="dxa"/>
+            </w:tcMar>
             <w:tcMar>
               <w:top w:w="40" w:type="dxa"/>
               <w:bottom w:w="40" w:type="dxa"/>

</xml_diff>